<commit_message>
UPDATED JUNE 23 2026
</commit_message>
<xml_diff>
--- a/TEMPLATE.docx
+++ b/TEMPLATE.docx
@@ -14,7 +14,7 @@
         <mc:AlternateContent>
           <mc:Choice Requires="wps">
             <w:drawing>
-              <wp:anchor distT="0" distB="0" distL="114300" distR="114300" simplePos="0" relativeHeight="251664384" behindDoc="0" locked="0" layoutInCell="1" allowOverlap="1" wp14:anchorId="773AB468" wp14:editId="78C01816">
+              <wp:anchor distT="0" distB="0" distL="114300" distR="114300" simplePos="0" relativeHeight="251664384" behindDoc="0" locked="0" layoutInCell="1" allowOverlap="1" wp14:anchorId="773AB468" wp14:editId="2B8DA9E3">
                 <wp:simplePos x="0" y="0"/>
                 <wp:positionH relativeFrom="margin">
                   <wp:posOffset>-137160</wp:posOffset>
@@ -96,7 +96,31 @@
                                 <w:szCs w:val="24"/>
                                 <w:u w:val="single"/>
                               </w:rPr>
-                              <w:t>{{contact_no}}</w:t>
+                              <w:t>{{</w:t>
+                            </w:r>
+                            <w:proofErr w:type="spellStart"/>
+                            <w:r>
+                              <w:rPr>
+                                <w:rFonts w:ascii="Arial" w:hAnsi="Arial" w:cs="Arial"/>
+                                <w:b/>
+                                <w:color w:val="1F4E79"/>
+                                <w:sz w:val="24"/>
+                                <w:szCs w:val="24"/>
+                                <w:u w:val="single"/>
+                              </w:rPr>
+                              <w:t>contact_no</w:t>
+                            </w:r>
+                            <w:proofErr w:type="spellEnd"/>
+                            <w:r>
+                              <w:rPr>
+                                <w:rFonts w:ascii="Arial" w:hAnsi="Arial" w:cs="Arial"/>
+                                <w:b/>
+                                <w:color w:val="1F4E79"/>
+                                <w:sz w:val="24"/>
+                                <w:szCs w:val="24"/>
+                                <w:u w:val="single"/>
+                              </w:rPr>
+                              <w:t>}}</w:t>
                             </w:r>
                           </w:p>
                         </w:txbxContent>
@@ -280,7 +304,41 @@
                                 <w:sz w:val="24"/>
                                 <w:szCs w:val="24"/>
                               </w:rPr>
-                              <w:t xml:space="preserve">{{np_clearance}}    </w:t>
+                              <w:t>{{</w:t>
+                            </w:r>
+                            <w:proofErr w:type="spellStart"/>
+                            <w:r>
+                              <w:rPr>
+                                <w:rFonts w:ascii="Arial" w:hAnsi="Arial" w:cs="Arial"/>
+                                <w:b/>
+                                <w:color w:val="1F4E79"/>
+                                <w:sz w:val="24"/>
+                                <w:szCs w:val="24"/>
+                              </w:rPr>
+                              <w:t>np_clearance</w:t>
+                            </w:r>
+                            <w:proofErr w:type="spellEnd"/>
+                            <w:proofErr w:type="gramStart"/>
+                            <w:r>
+                              <w:rPr>
+                                <w:rFonts w:ascii="Arial" w:hAnsi="Arial" w:cs="Arial"/>
+                                <w:b/>
+                                <w:color w:val="1F4E79"/>
+                                <w:sz w:val="24"/>
+                                <w:szCs w:val="24"/>
+                              </w:rPr>
+                              <w:t xml:space="preserve">}}   </w:t>
+                            </w:r>
+                            <w:proofErr w:type="gramEnd"/>
+                            <w:r>
+                              <w:rPr>
+                                <w:rFonts w:ascii="Arial" w:hAnsi="Arial" w:cs="Arial"/>
+                                <w:b/>
+                                <w:color w:val="1F4E79"/>
+                                <w:sz w:val="24"/>
+                                <w:szCs w:val="24"/>
+                              </w:rPr>
+                              <w:t xml:space="preserve"> </w:t>
                             </w:r>
                             <w:r>
                               <w:rPr>
@@ -332,6 +390,7 @@
                               </w:rPr>
                               <w:t xml:space="preserve">            </w:t>
                             </w:r>
+                            <w:proofErr w:type="gramStart"/>
                             <w:r>
                               <w:rPr>
                                 <w:rFonts w:ascii="Arial" w:hAnsi="Arial" w:cs="Arial"/>
@@ -350,7 +409,40 @@
                                 <w:sz w:val="24"/>
                                 <w:szCs w:val="24"/>
                               </w:rPr>
-                              <w:t>{{document_date}}</w:t>
+                              <w:t>{</w:t>
+                            </w:r>
+                            <w:proofErr w:type="gramEnd"/>
+                            <w:r>
+                              <w:rPr>
+                                <w:rFonts w:ascii="Arial" w:hAnsi="Arial" w:cs="Arial"/>
+                                <w:b/>
+                                <w:color w:val="1F4E79"/>
+                                <w:sz w:val="24"/>
+                                <w:szCs w:val="24"/>
+                              </w:rPr>
+                              <w:t>{</w:t>
+                            </w:r>
+                            <w:proofErr w:type="spellStart"/>
+                            <w:r>
+                              <w:rPr>
+                                <w:rFonts w:ascii="Arial" w:hAnsi="Arial" w:cs="Arial"/>
+                                <w:b/>
+                                <w:color w:val="1F4E79"/>
+                                <w:sz w:val="24"/>
+                                <w:szCs w:val="24"/>
+                              </w:rPr>
+                              <w:t>document_date</w:t>
+                            </w:r>
+                            <w:proofErr w:type="spellEnd"/>
+                            <w:r>
+                              <w:rPr>
+                                <w:rFonts w:ascii="Arial" w:hAnsi="Arial" w:cs="Arial"/>
+                                <w:b/>
+                                <w:color w:val="1F4E79"/>
+                                <w:sz w:val="24"/>
+                                <w:szCs w:val="24"/>
+                              </w:rPr>
+                              <w:t>}}</w:t>
                             </w:r>
                           </w:p>
                           <w:p>
@@ -386,11 +478,7 @@
           </mc:Choice>
           <mc:Fallback>
             <w:pict>
-              <v:shapetype w14:anchorId="2227E0A9" id="_x0000_t202" coordsize="21600,21600" o:spt="202" path="m,l,21600r21600,l21600,xe">
-                <v:stroke joinstyle="miter"/>
-                <v:path gradientshapeok="t" o:connecttype="rect"/>
-              </v:shapetype>
-              <v:shape id="Text Box 18" o:spid="_x0000_s1027" type="#_x0000_t202" style="position:absolute;margin-left:22.5pt;margin-top:54pt;width:538.4pt;height:27pt;z-index:251655168;visibility:visible;mso-wrap-style:square;mso-width-percent:0;mso-height-percent:0;mso-wrap-distance-left:9pt;mso-wrap-distance-top:0;mso-wrap-distance-right:9pt;mso-wrap-distance-bottom:0;mso-position-horizontal:absolute;mso-position-horizontal-relative:margin;mso-position-vertical:absolute;mso-position-vertical-relative:text;mso-width-percent:0;mso-height-percent:0;mso-width-relative:margin;mso-height-relative:margin;v-text-anchor:top" o:gfxdata="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" filled="f" stroked="f">
+              <v:shape w14:anchorId="2227E0A9" id="Text Box 18" o:spid="_x0000_s1027" type="#_x0000_t202" style="position:absolute;margin-left:22.5pt;margin-top:54pt;width:538.4pt;height:27pt;z-index:251655168;visibility:visible;mso-wrap-style:square;mso-width-percent:0;mso-height-percent:0;mso-wrap-distance-left:9pt;mso-wrap-distance-top:0;mso-wrap-distance-right:9pt;mso-wrap-distance-bottom:0;mso-position-horizontal:absolute;mso-position-horizontal-relative:margin;mso-position-vertical:absolute;mso-position-vertical-relative:text;mso-width-percent:0;mso-height-percent:0;mso-width-relative:margin;mso-height-relative:margin;v-text-anchor:top" o:gfxdata="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" filled="f" stroked="f">
                 <v:textbox>
                   <w:txbxContent>
                     <w:p>
@@ -435,6 +523,7 @@
                         <w:t>np_clearance</w:t>
                       </w:r>
                       <w:proofErr w:type="spellEnd"/>
+                      <w:proofErr w:type="gramStart"/>
                       <w:r>
                         <w:rPr>
                           <w:rFonts w:ascii="Arial" w:hAnsi="Arial" w:cs="Arial"/>
@@ -443,7 +532,18 @@
                           <w:sz w:val="24"/>
                           <w:szCs w:val="24"/>
                         </w:rPr>
-                        <w:t xml:space="preserve">}}    </w:t>
+                        <w:t xml:space="preserve">}}   </w:t>
+                      </w:r>
+                      <w:proofErr w:type="gramEnd"/>
+                      <w:r>
+                        <w:rPr>
+                          <w:rFonts w:ascii="Arial" w:hAnsi="Arial" w:cs="Arial"/>
+                          <w:b/>
+                          <w:color w:val="1F4E79"/>
+                          <w:sz w:val="24"/>
+                          <w:szCs w:val="24"/>
+                        </w:rPr>
+                        <w:t xml:space="preserve"> </w:t>
                       </w:r>
                       <w:r>
                         <w:rPr>
@@ -495,6 +595,7 @@
                         </w:rPr>
                         <w:t xml:space="preserve">            </w:t>
                       </w:r>
+                      <w:proofErr w:type="gramStart"/>
                       <w:r>
                         <w:rPr>
                           <w:rFonts w:ascii="Arial" w:hAnsi="Arial" w:cs="Arial"/>
@@ -513,7 +614,18 @@
                           <w:sz w:val="24"/>
                           <w:szCs w:val="24"/>
                         </w:rPr>
-                        <w:t>{{</w:t>
+                        <w:t>{</w:t>
+                      </w:r>
+                      <w:proofErr w:type="gramEnd"/>
+                      <w:r>
+                        <w:rPr>
+                          <w:rFonts w:ascii="Arial" w:hAnsi="Arial" w:cs="Arial"/>
+                          <w:b/>
+                          <w:color w:val="1F4E79"/>
+                          <w:sz w:val="24"/>
+                          <w:szCs w:val="24"/>
+                        </w:rPr>
+                        <w:t>{</w:t>
                       </w:r>
                       <w:proofErr w:type="spellStart"/>
                       <w:r>
@@ -697,7 +809,7 @@
         <mc:AlternateContent>
           <mc:Choice Requires="wps">
             <w:drawing>
-              <wp:anchor distT="0" distB="0" distL="114300" distR="114300" simplePos="0" relativeHeight="251662336" behindDoc="0" locked="0" layoutInCell="1" allowOverlap="1" wp14:anchorId="6EE27601" wp14:editId="2CB459F2">
+              <wp:anchor distT="0" distB="0" distL="114300" distR="114300" simplePos="0" relativeHeight="251662336" behindDoc="0" locked="0" layoutInCell="1" allowOverlap="1" wp14:anchorId="6EE27601" wp14:editId="3116CDEC">
                 <wp:simplePos x="0" y="0"/>
                 <wp:positionH relativeFrom="margin">
                   <wp:posOffset>5359400</wp:posOffset>
@@ -752,7 +864,29 @@
                                 <w:sz w:val="24"/>
                                 <w:szCs w:val="24"/>
                               </w:rPr>
-                              <w:t>{{civil_status}}</w:t>
+                              <w:t>{{</w:t>
+                            </w:r>
+                            <w:proofErr w:type="spellStart"/>
+                            <w:r>
+                              <w:rPr>
+                                <w:rFonts w:ascii="Arial" w:hAnsi="Arial" w:cs="Arial"/>
+                                <w:b/>
+                                <w:color w:val="1F4E79"/>
+                                <w:sz w:val="24"/>
+                                <w:szCs w:val="24"/>
+                              </w:rPr>
+                              <w:t>civil_status</w:t>
+                            </w:r>
+                            <w:proofErr w:type="spellEnd"/>
+                            <w:r>
+                              <w:rPr>
+                                <w:rFonts w:ascii="Arial" w:hAnsi="Arial" w:cs="Arial"/>
+                                <w:b/>
+                                <w:color w:val="1F4E79"/>
+                                <w:sz w:val="24"/>
+                                <w:szCs w:val="24"/>
+                              </w:rPr>
+                              <w:t>}}</w:t>
                             </w:r>
                           </w:p>
                           <w:p>
@@ -976,8 +1110,9 @@
           <w:sz w:val="20"/>
           <w:szCs w:val="20"/>
         </w:rPr>
-        <w:t>NP Clearance:___</w:t>
-      </w:r>
+        <w:t xml:space="preserve">NP </w:t>
+      </w:r>
+      <w:proofErr w:type="gramStart"/>
       <w:r>
         <w:rPr>
           <w:rFonts w:ascii="Arial" w:hAnsi="Arial" w:cs="Arial"/>
@@ -986,8 +1121,9 @@
           <w:sz w:val="20"/>
           <w:szCs w:val="20"/>
         </w:rPr>
-        <w:t>___________________________</w:t>
-      </w:r>
+        <w:t>Clearance:_</w:t>
+      </w:r>
+      <w:proofErr w:type="gramEnd"/>
       <w:r>
         <w:rPr>
           <w:rFonts w:ascii="Arial" w:hAnsi="Arial" w:cs="Arial"/>
@@ -996,7 +1132,7 @@
           <w:sz w:val="20"/>
           <w:szCs w:val="20"/>
         </w:rPr>
-        <w:tab/>
+        <w:t>__</w:t>
       </w:r>
       <w:r>
         <w:rPr>
@@ -1006,7 +1142,7 @@
           <w:sz w:val="20"/>
           <w:szCs w:val="20"/>
         </w:rPr>
-        <w:tab/>
+        <w:t>___________________________</w:t>
       </w:r>
       <w:r>
         <w:rPr>
@@ -1016,7 +1152,39 @@
           <w:sz w:val="20"/>
           <w:szCs w:val="20"/>
         </w:rPr>
-        <w:t>Date:__________________</w:t>
+        <w:tab/>
+      </w:r>
+      <w:r>
+        <w:rPr>
+          <w:rFonts w:ascii="Arial" w:hAnsi="Arial" w:cs="Arial"/>
+          <w:b/>
+          <w:color w:val="1F4E79"/>
+          <w:sz w:val="20"/>
+          <w:szCs w:val="20"/>
+        </w:rPr>
+        <w:tab/>
+      </w:r>
+      <w:proofErr w:type="gramStart"/>
+      <w:r>
+        <w:rPr>
+          <w:rFonts w:ascii="Arial" w:hAnsi="Arial" w:cs="Arial"/>
+          <w:b/>
+          <w:color w:val="1F4E79"/>
+          <w:sz w:val="20"/>
+          <w:szCs w:val="20"/>
+        </w:rPr>
+        <w:t>Date:_</w:t>
+      </w:r>
+      <w:proofErr w:type="gramEnd"/>
+      <w:r>
+        <w:rPr>
+          <w:rFonts w:ascii="Arial" w:hAnsi="Arial" w:cs="Arial"/>
+          <w:b/>
+          <w:color w:val="1F4E79"/>
+          <w:sz w:val="20"/>
+          <w:szCs w:val="20"/>
+        </w:rPr>
+        <w:t>_________________</w:t>
       </w:r>
     </w:p>
     <w:p>
@@ -1039,7 +1207,7 @@
         <mc:AlternateContent>
           <mc:Choice Requires="wps">
             <w:drawing>
-              <wp:anchor distT="0" distB="0" distL="114300" distR="114300" simplePos="0" relativeHeight="251657216" behindDoc="0" locked="0" layoutInCell="1" allowOverlap="1" wp14:anchorId="2A7A82E1" wp14:editId="5AA6D49B">
+              <wp:anchor distT="0" distB="0" distL="114300" distR="114300" simplePos="0" relativeHeight="251657216" behindDoc="0" locked="0" layoutInCell="1" allowOverlap="1" wp14:anchorId="2A7A82E1" wp14:editId="344F6631">
                 <wp:simplePos x="0" y="0"/>
                 <wp:positionH relativeFrom="margin">
                   <wp:posOffset>1143000</wp:posOffset>
@@ -1094,7 +1262,29 @@
                                 <w:sz w:val="24"/>
                                 <w:szCs w:val="24"/>
                               </w:rPr>
-                              <w:t>{{home_address}}</w:t>
+                              <w:t>{{</w:t>
+                            </w:r>
+                            <w:proofErr w:type="spellStart"/>
+                            <w:r>
+                              <w:rPr>
+                                <w:rFonts w:ascii="Arial" w:hAnsi="Arial" w:cs="Arial"/>
+                                <w:b/>
+                                <w:color w:val="1F4E79"/>
+                                <w:sz w:val="24"/>
+                                <w:szCs w:val="24"/>
+                              </w:rPr>
+                              <w:t>home_address</w:t>
+                            </w:r>
+                            <w:proofErr w:type="spellEnd"/>
+                            <w:r>
+                              <w:rPr>
+                                <w:rFonts w:ascii="Arial" w:hAnsi="Arial" w:cs="Arial"/>
+                                <w:b/>
+                                <w:color w:val="1F4E79"/>
+                                <w:sz w:val="24"/>
+                                <w:szCs w:val="24"/>
+                              </w:rPr>
+                              <w:t>}}</w:t>
                             </w:r>
                           </w:p>
                           <w:p>
@@ -1267,6 +1457,7 @@
         </w:rPr>
         <w:t xml:space="preserve">: </w:t>
       </w:r>
+      <w:proofErr w:type="gramStart"/>
       <w:r>
         <w:rPr>
           <w:rFonts w:ascii="Arial" w:hAnsi="Arial" w:cs="Arial"/>
@@ -1298,8 +1489,9 @@
           <w:szCs w:val="24"/>
           <w:u w:val="single"/>
         </w:rPr>
-        <w:t>{{age}}</w:t>
-      </w:r>
+        <w:t>{</w:t>
+      </w:r>
+      <w:proofErr w:type="gramEnd"/>
       <w:r>
         <w:rPr>
           <w:rFonts w:ascii="Arial" w:hAnsi="Arial" w:cs="Arial"/>
@@ -1309,6 +1501,29 @@
           <w:szCs w:val="24"/>
           <w:u w:val="single"/>
         </w:rPr>
+        <w:t>{age</w:t>
+      </w:r>
+      <w:proofErr w:type="gramStart"/>
+      <w:r>
+        <w:rPr>
+          <w:rFonts w:ascii="Arial" w:hAnsi="Arial" w:cs="Arial"/>
+          <w:b/>
+          <w:color w:val="1F4E79"/>
+          <w:sz w:val="24"/>
+          <w:szCs w:val="24"/>
+          <w:u w:val="single"/>
+        </w:rPr>
+        <w:t>}}</w:t>
+      </w:r>
+      <w:r>
+        <w:rPr>
+          <w:rFonts w:ascii="Arial" w:hAnsi="Arial" w:cs="Arial"/>
+          <w:b/>
+          <w:color w:val="1F4E79"/>
+          <w:sz w:val="24"/>
+          <w:szCs w:val="24"/>
+          <w:u w:val="single"/>
+        </w:rPr>
         <w:t xml:space="preserve"> </w:t>
       </w:r>
       <w:r>
@@ -1333,6 +1548,7 @@
         </w:rPr>
         <w:t xml:space="preserve"> </w:t>
       </w:r>
+      <w:proofErr w:type="gramEnd"/>
       <w:r>
         <w:rPr>
           <w:rFonts w:ascii="Arial" w:hAnsi="Arial" w:cs="Arial"/>
@@ -1434,16 +1650,135 @@
         <mc:AlternateContent>
           <mc:Choice Requires="wps">
             <w:drawing>
-              <wp:anchor distT="0" distB="0" distL="114300" distR="114300" simplePos="0" relativeHeight="251658240" behindDoc="0" locked="0" layoutInCell="1" allowOverlap="1" wp14:anchorId="38FBBEEB" wp14:editId="7428983A">
+              <wp:anchor distT="0" distB="0" distL="114300" distR="114300" simplePos="0" relativeHeight="251667456" behindDoc="0" locked="0" layoutInCell="1" allowOverlap="1" wp14:anchorId="2D6E4712" wp14:editId="62DCF0E7">
                 <wp:simplePos x="0" y="0"/>
                 <wp:positionH relativeFrom="margin">
-                  <wp:posOffset>912495</wp:posOffset>
+                  <wp:posOffset>5086721</wp:posOffset>
                 </wp:positionH>
                 <wp:positionV relativeFrom="paragraph">
-                  <wp:posOffset>208280</wp:posOffset>
+                  <wp:posOffset>198120</wp:posOffset>
                 </wp:positionV>
-                <wp:extent cx="6419850" cy="257175"/>
-                <wp:effectExtent l="0" t="0" r="0" b="0"/>
+                <wp:extent cx="2837815" cy="257175"/>
+                <wp:effectExtent l="0" t="0" r="0" b="9525"/>
+                <wp:wrapNone/>
+                <wp:docPr id="973191866" name="Text Box 12"/>
+                <wp:cNvGraphicFramePr>
+                  <a:graphicFrameLocks xmlns:a="http://schemas.openxmlformats.org/drawingml/2006/main"/>
+                </wp:cNvGraphicFramePr>
+                <a:graphic xmlns:a="http://schemas.openxmlformats.org/drawingml/2006/main">
+                  <a:graphicData uri="http://schemas.microsoft.com/office/word/2010/wordprocessingShape">
+                    <wps:wsp>
+                      <wps:cNvSpPr txBox="1">
+                        <a:spLocks/>
+                      </wps:cNvSpPr>
+                      <wps:spPr>
+                        <a:xfrm>
+                          <a:off x="0" y="0"/>
+                          <a:ext cx="2837815" cy="257175"/>
+                        </a:xfrm>
+                        <a:prstGeom prst="rect">
+                          <a:avLst/>
+                        </a:prstGeom>
+                        <a:noFill/>
+                        <a:ln>
+                          <a:noFill/>
+                        </a:ln>
+                        <a:effectLst/>
+                      </wps:spPr>
+                      <wps:txbx>
+                        <w:txbxContent>
+                          <w:p>
+                            <w:pPr>
+                              <w:rPr>
+                                <w:rFonts w:ascii="Arial" w:hAnsi="Arial" w:cs="Arial"/>
+                                <w:b/>
+                                <w:color w:val="1F4E79"/>
+                                <w:sz w:val="24"/>
+                                <w:szCs w:val="24"/>
+                              </w:rPr>
+                            </w:pPr>
+                            <w:r>
+                              <w:rPr>
+                                <w:rFonts w:ascii="Arial" w:hAnsi="Arial" w:cs="Arial"/>
+                                <w:b/>
+                                <w:color w:val="1F4E79"/>
+                                <w:sz w:val="24"/>
+                                <w:szCs w:val="24"/>
+                              </w:rPr>
+                              <w:t>{{position}}</w:t>
+                            </w:r>
+                          </w:p>
+                        </w:txbxContent>
+                      </wps:txbx>
+                      <wps:bodyPr rot="0" spcFirstLastPara="0" vertOverflow="overflow" horzOverflow="overflow" vert="horz" wrap="square" lIns="91440" tIns="45720" rIns="91440" bIns="45720" numCol="1" spcCol="0" rtlCol="0" fromWordArt="0" anchor="t" anchorCtr="0" forceAA="0" compatLnSpc="1">
+                        <a:prstTxWarp prst="textNoShape">
+                          <a:avLst/>
+                        </a:prstTxWarp>
+                        <a:noAutofit/>
+                      </wps:bodyPr>
+                    </wps:wsp>
+                  </a:graphicData>
+                </a:graphic>
+                <wp14:sizeRelH relativeFrom="margin">
+                  <wp14:pctWidth>0</wp14:pctWidth>
+                </wp14:sizeRelH>
+                <wp14:sizeRelV relativeFrom="margin">
+                  <wp14:pctHeight>0</wp14:pctHeight>
+                </wp14:sizeRelV>
+              </wp:anchor>
+            </w:drawing>
+          </mc:Choice>
+          <mc:Fallback>
+            <w:pict>
+              <v:shape w14:anchorId="2D6E4712" id="Text Box 12" o:spid="_x0000_s1031" type="#_x0000_t202" style="position:absolute;margin-left:400.55pt;margin-top:15.6pt;width:223.45pt;height:20.25pt;z-index:251667456;visibility:visible;mso-wrap-style:square;mso-width-percent:0;mso-height-percent:0;mso-wrap-distance-left:9pt;mso-wrap-distance-top:0;mso-wrap-distance-right:9pt;mso-wrap-distance-bottom:0;mso-position-horizontal:absolute;mso-position-horizontal-relative:margin;mso-position-vertical:absolute;mso-position-vertical-relative:text;mso-width-percent:0;mso-height-percent:0;mso-width-relative:margin;mso-height-relative:margin;v-text-anchor:top" o:gfxdata="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" filled="f" stroked="f">
+                <v:textbox>
+                  <w:txbxContent>
+                    <w:p>
+                      <w:pPr>
+                        <w:rPr>
+                          <w:rFonts w:ascii="Arial" w:hAnsi="Arial" w:cs="Arial"/>
+                          <w:b/>
+                          <w:color w:val="1F4E79"/>
+                          <w:sz w:val="24"/>
+                          <w:szCs w:val="24"/>
+                        </w:rPr>
+                      </w:pPr>
+                      <w:r>
+                        <w:rPr>
+                          <w:rFonts w:ascii="Arial" w:hAnsi="Arial" w:cs="Arial"/>
+                          <w:b/>
+                          <w:color w:val="1F4E79"/>
+                          <w:sz w:val="24"/>
+                          <w:szCs w:val="24"/>
+                        </w:rPr>
+                        <w:t>{{position}}</w:t>
+                      </w:r>
+                    </w:p>
+                  </w:txbxContent>
+                </v:textbox>
+                <w10:wrap anchorx="margin"/>
+              </v:shape>
+            </w:pict>
+          </mc:Fallback>
+        </mc:AlternateContent>
+      </w:r>
+      <w:r>
+        <w:rPr>
+          <w:noProof/>
+        </w:rPr>
+        <mc:AlternateContent>
+          <mc:Choice Requires="wps">
+            <w:drawing>
+              <wp:anchor distT="0" distB="0" distL="114300" distR="114300" simplePos="0" relativeHeight="251658240" behindDoc="0" locked="0" layoutInCell="1" allowOverlap="1" wp14:anchorId="38FBBEEB" wp14:editId="5B428F40">
+                <wp:simplePos x="0" y="0"/>
+                <wp:positionH relativeFrom="margin">
+                  <wp:posOffset>914400</wp:posOffset>
+                </wp:positionH>
+                <wp:positionV relativeFrom="paragraph">
+                  <wp:posOffset>208999</wp:posOffset>
+                </wp:positionV>
+                <wp:extent cx="3424687" cy="257175"/>
+                <wp:effectExtent l="0" t="0" r="0" b="9525"/>
                 <wp:wrapNone/>
                 <wp:docPr id="10" name="Text Box 12"/>
                 <wp:cNvGraphicFramePr>
@@ -1458,7 +1793,7 @@
                       <wps:spPr>
                         <a:xfrm>
                           <a:off x="0" y="0"/>
-                          <a:ext cx="6419850" cy="257175"/>
+                          <a:ext cx="3424687" cy="257175"/>
                         </a:xfrm>
                         <a:prstGeom prst="rect">
                           <a:avLst/>
@@ -1531,66 +1866,6 @@
                               </w:rPr>
                               <w:tab/>
                             </w:r>
-                            <w:r>
-                              <w:rPr>
-                                <w:rFonts w:ascii="Arial" w:hAnsi="Arial" w:cs="Arial"/>
-                                <w:b/>
-                                <w:color w:val="1F4E79"/>
-                                <w:sz w:val="24"/>
-                                <w:szCs w:val="24"/>
-                              </w:rPr>
-                              <w:tab/>
-                            </w:r>
-                            <w:r>
-                              <w:rPr>
-                                <w:rFonts w:ascii="Arial" w:hAnsi="Arial" w:cs="Arial"/>
-                                <w:b/>
-                                <w:color w:val="1F4E79"/>
-                                <w:sz w:val="24"/>
-                                <w:szCs w:val="24"/>
-                              </w:rPr>
-                              <w:t xml:space="preserve">  </w:t>
-                            </w:r>
-                            <w:r>
-                              <w:rPr>
-                                <w:rFonts w:ascii="Arial" w:hAnsi="Arial" w:cs="Arial"/>
-                                <w:b/>
-                                <w:color w:val="1F4E79"/>
-                                <w:sz w:val="24"/>
-                                <w:szCs w:val="24"/>
-                              </w:rPr>
-                              <w:t xml:space="preserve">          </w:t>
-                            </w:r>
-                            <w:r>
-                              <w:rPr>
-                                <w:rFonts w:ascii="Arial" w:hAnsi="Arial" w:cs="Arial"/>
-                                <w:b/>
-                                <w:color w:val="1F4E79"/>
-                                <w:sz w:val="24"/>
-                                <w:szCs w:val="24"/>
-                              </w:rPr>
-                              <w:t xml:space="preserve">          </w:t>
-                            </w:r>
-                            <w:r>
-                              <w:rPr>
-                                <w:rFonts w:ascii="Arial" w:hAnsi="Arial" w:cs="Arial"/>
-                                <w:b/>
-                                <w:color w:val="1F4E79"/>
-                                <w:sz w:val="24"/>
-                                <w:szCs w:val="24"/>
-                              </w:rPr>
-                              <w:t xml:space="preserve"> </w:t>
-                            </w:r>
-                            <w:r>
-                              <w:rPr>
-                                <w:rFonts w:ascii="Arial" w:hAnsi="Arial" w:cs="Arial"/>
-                                <w:b/>
-                                <w:color w:val="1F4E79"/>
-                                <w:sz w:val="24"/>
-                                <w:szCs w:val="24"/>
-                              </w:rPr>
-                              <w:t>{{position}}</w:t>
-                            </w:r>
                           </w:p>
                         </w:txbxContent>
                       </wps:txbx>
@@ -1614,11 +1889,7 @@
           </mc:Choice>
           <mc:Fallback>
             <w:pict>
-              <v:shapetype w14:anchorId="38FBBEEB" id="_x0000_t202" coordsize="21600,21600" o:spt="202" path="m,l,21600r21600,l21600,xe">
-                <v:stroke joinstyle="miter"/>
-                <v:path gradientshapeok="t" o:connecttype="rect"/>
-              </v:shapetype>
-              <v:shape id="Text Box 12" o:spid="_x0000_s1031" type="#_x0000_t202" style="position:absolute;margin-left:71.85pt;margin-top:16.4pt;width:505.5pt;height:20.25pt;z-index:251658240;visibility:visible;mso-wrap-style:square;mso-width-percent:0;mso-height-percent:0;mso-wrap-distance-left:9pt;mso-wrap-distance-top:0;mso-wrap-distance-right:9pt;mso-wrap-distance-bottom:0;mso-position-horizontal:absolute;mso-position-horizontal-relative:margin;mso-position-vertical:absolute;mso-position-vertical-relative:text;mso-width-percent:0;mso-height-percent:0;mso-width-relative:margin;mso-height-relative:margin;v-text-anchor:top" o:gfxdata="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" filled="f" stroked="f">
+              <v:shape w14:anchorId="38FBBEEB" id="_x0000_s1032" type="#_x0000_t202" style="position:absolute;margin-left:1in;margin-top:16.45pt;width:269.65pt;height:20.25pt;z-index:251658240;visibility:visible;mso-wrap-style:square;mso-width-percent:0;mso-height-percent:0;mso-wrap-distance-left:9pt;mso-wrap-distance-top:0;mso-wrap-distance-right:9pt;mso-wrap-distance-bottom:0;mso-position-horizontal:absolute;mso-position-horizontal-relative:margin;mso-position-vertical:absolute;mso-position-vertical-relative:text;mso-width-percent:0;mso-height-percent:0;mso-width-relative:margin;mso-height-relative:margin;v-text-anchor:top" o:gfxdata="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" filled="f" stroked="f">
                 <v:textbox>
                   <w:txbxContent>
                     <w:p>
@@ -1680,66 +1951,6 @@
                           <w:szCs w:val="24"/>
                         </w:rPr>
                         <w:tab/>
-                      </w:r>
-                      <w:r>
-                        <w:rPr>
-                          <w:rFonts w:ascii="Arial" w:hAnsi="Arial" w:cs="Arial"/>
-                          <w:b/>
-                          <w:color w:val="1F4E79"/>
-                          <w:sz w:val="24"/>
-                          <w:szCs w:val="24"/>
-                        </w:rPr>
-                        <w:tab/>
-                      </w:r>
-                      <w:r>
-                        <w:rPr>
-                          <w:rFonts w:ascii="Arial" w:hAnsi="Arial" w:cs="Arial"/>
-                          <w:b/>
-                          <w:color w:val="1F4E79"/>
-                          <w:sz w:val="24"/>
-                          <w:szCs w:val="24"/>
-                        </w:rPr>
-                        <w:t xml:space="preserve">  </w:t>
-                      </w:r>
-                      <w:r>
-                        <w:rPr>
-                          <w:rFonts w:ascii="Arial" w:hAnsi="Arial" w:cs="Arial"/>
-                          <w:b/>
-                          <w:color w:val="1F4E79"/>
-                          <w:sz w:val="24"/>
-                          <w:szCs w:val="24"/>
-                        </w:rPr>
-                        <w:t xml:space="preserve">          </w:t>
-                      </w:r>
-                      <w:r>
-                        <w:rPr>
-                          <w:rFonts w:ascii="Arial" w:hAnsi="Arial" w:cs="Arial"/>
-                          <w:b/>
-                          <w:color w:val="1F4E79"/>
-                          <w:sz w:val="24"/>
-                          <w:szCs w:val="24"/>
-                        </w:rPr>
-                        <w:t xml:space="preserve">          </w:t>
-                      </w:r>
-                      <w:r>
-                        <w:rPr>
-                          <w:rFonts w:ascii="Arial" w:hAnsi="Arial" w:cs="Arial"/>
-                          <w:b/>
-                          <w:color w:val="1F4E79"/>
-                          <w:sz w:val="24"/>
-                          <w:szCs w:val="24"/>
-                        </w:rPr>
-                        <w:t xml:space="preserve"> </w:t>
-                      </w:r>
-                      <w:r>
-                        <w:rPr>
-                          <w:rFonts w:ascii="Arial" w:hAnsi="Arial" w:cs="Arial"/>
-                          <w:b/>
-                          <w:color w:val="1F4E79"/>
-                          <w:sz w:val="24"/>
-                          <w:szCs w:val="24"/>
-                        </w:rPr>
-                        <w:t>{{position}}</w:t>
                       </w:r>
                     </w:p>
                   </w:txbxContent>
@@ -1923,7 +2134,7 @@
           </mc:Choice>
           <mc:Fallback>
             <w:pict>
-              <v:shape w14:anchorId="2CD7FFCC" id="Text Box 10" o:spid="_x0000_s1032" type="#_x0000_t202" style="position:absolute;margin-left:77.1pt;margin-top:14.7pt;width:204.25pt;height:24pt;z-index:251659264;visibility:visible;mso-wrap-style:square;mso-width-percent:0;mso-height-percent:0;mso-wrap-distance-left:9pt;mso-wrap-distance-top:0;mso-wrap-distance-right:9pt;mso-wrap-distance-bottom:0;mso-position-horizontal:absolute;mso-position-horizontal-relative:margin;mso-position-vertical:absolute;mso-position-vertical-relative:text;mso-width-percent:0;mso-height-percent:0;mso-width-relative:margin;mso-height-relative:margin;v-text-anchor:top" o:gfxdata="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" filled="f" stroked="f">
+              <v:shape w14:anchorId="2CD7FFCC" id="Text Box 10" o:spid="_x0000_s1033" type="#_x0000_t202" style="position:absolute;margin-left:77.1pt;margin-top:14.7pt;width:204.25pt;height:24pt;z-index:251659264;visibility:visible;mso-wrap-style:square;mso-width-percent:0;mso-height-percent:0;mso-wrap-distance-left:9pt;mso-wrap-distance-top:0;mso-wrap-distance-right:9pt;mso-wrap-distance-bottom:0;mso-position-horizontal:absolute;mso-position-horizontal-relative:margin;mso-position-vertical:absolute;mso-position-vertical-relative:text;mso-width-percent:0;mso-height-percent:0;mso-width-relative:margin;mso-height-relative:margin;v-text-anchor:top" o:gfxdata="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" filled="f" stroked="f">
                 <v:textbox>
                   <w:txbxContent>
                     <w:p>
@@ -2060,7 +2271,7 @@
           </mc:Choice>
           <mc:Fallback>
             <w:pict>
-              <v:shape w14:anchorId="757CFCBD" id="Text Box 8" o:spid="_x0000_s1033" type="#_x0000_t202" style="position:absolute;margin-left:362.85pt;margin-top:14.7pt;width:170.5pt;height:22.5pt;z-index:251663360;visibility:visible;mso-wrap-style:square;mso-width-percent:0;mso-height-percent:0;mso-wrap-distance-left:9pt;mso-wrap-distance-top:0;mso-wrap-distance-right:9pt;mso-wrap-distance-bottom:0;mso-position-horizontal:absolute;mso-position-horizontal-relative:margin;mso-position-vertical:absolute;mso-position-vertical-relative:text;mso-width-percent:0;mso-height-percent:0;mso-width-relative:margin;mso-height-relative:margin;v-text-anchor:top" o:gfxdata="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" filled="f" stroked="f">
+              <v:shape w14:anchorId="757CFCBD" id="Text Box 8" o:spid="_x0000_s1034" type="#_x0000_t202" style="position:absolute;margin-left:362.85pt;margin-top:14.7pt;width:170.5pt;height:22.5pt;z-index:251663360;visibility:visible;mso-wrap-style:square;mso-width-percent:0;mso-height-percent:0;mso-wrap-distance-left:9pt;mso-wrap-distance-top:0;mso-wrap-distance-right:9pt;mso-wrap-distance-bottom:0;mso-position-horizontal:absolute;mso-position-horizontal-relative:margin;mso-position-vertical:absolute;mso-position-vertical-relative:text;mso-width-percent:0;mso-height-percent:0;mso-width-relative:margin;mso-height-relative:margin;v-text-anchor:top" o:gfxdata="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" filled="f" stroked="f">
                 <v:textbox>
                   <w:txbxContent>
                     <w:p>
@@ -2273,7 +2484,29 @@
                                 <w:sz w:val="24"/>
                                 <w:szCs w:val="24"/>
                               </w:rPr>
-                              <w:t>{{company_requesting_agency}}</w:t>
+                              <w:t>{{</w:t>
+                            </w:r>
+                            <w:proofErr w:type="spellStart"/>
+                            <w:r>
+                              <w:rPr>
+                                <w:rFonts w:ascii="Arial" w:hAnsi="Arial" w:cs="Arial"/>
+                                <w:b/>
+                                <w:color w:val="1F4E79"/>
+                                <w:sz w:val="24"/>
+                                <w:szCs w:val="24"/>
+                              </w:rPr>
+                              <w:t>company_requesting_agency</w:t>
+                            </w:r>
+                            <w:proofErr w:type="spellEnd"/>
+                            <w:r>
+                              <w:rPr>
+                                <w:rFonts w:ascii="Arial" w:hAnsi="Arial" w:cs="Arial"/>
+                                <w:b/>
+                                <w:color w:val="1F4E79"/>
+                                <w:sz w:val="24"/>
+                                <w:szCs w:val="24"/>
+                              </w:rPr>
+                              <w:t>}}</w:t>
                             </w:r>
                           </w:p>
                           <w:p>
@@ -2310,7 +2543,7 @@
           </mc:Choice>
           <mc:Fallback>
             <w:pict>
-              <v:shape w14:anchorId="56F8D160" id="Text Box 6" o:spid="_x0000_s1034" type="#_x0000_t202" style="position:absolute;margin-left:171.85pt;margin-top:9.4pt;width:314.9pt;height:20.25pt;z-index:251660288;visibility:visible;mso-wrap-style:square;mso-width-percent:0;mso-height-percent:0;mso-wrap-distance-left:9pt;mso-wrap-distance-top:0;mso-wrap-distance-right:9pt;mso-wrap-distance-bottom:0;mso-position-horizontal:absolute;mso-position-horizontal-relative:margin;mso-position-vertical:absolute;mso-position-vertical-relative:text;mso-width-percent:0;mso-height-percent:0;mso-width-relative:margin;mso-height-relative:margin;v-text-anchor:top" o:gfxdata="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" filled="f" stroked="f">
+              <v:shape w14:anchorId="56F8D160" id="Text Box 6" o:spid="_x0000_s1035" type="#_x0000_t202" style="position:absolute;margin-left:171.85pt;margin-top:9.4pt;width:314.9pt;height:20.25pt;z-index:251660288;visibility:visible;mso-wrap-style:square;mso-width-percent:0;mso-height-percent:0;mso-wrap-distance-left:9pt;mso-wrap-distance-top:0;mso-wrap-distance-right:9pt;mso-wrap-distance-bottom:0;mso-position-horizontal:absolute;mso-position-horizontal-relative:margin;mso-position-vertical:absolute;mso-position-vertical-relative:text;mso-width-percent:0;mso-height-percent:0;mso-width-relative:margin;mso-height-relative:margin;v-text-anchor:top" o:gfxdata="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" filled="f" stroked="f">
                 <v:textbox>
                   <w:txbxContent>
                     <w:p>
@@ -2341,7 +2574,29 @@
                           <w:sz w:val="24"/>
                           <w:szCs w:val="24"/>
                         </w:rPr>
-                        <w:t>{{company_requesting_agency}}</w:t>
+                        <w:t>{{</w:t>
+                      </w:r>
+                      <w:proofErr w:type="spellStart"/>
+                      <w:r>
+                        <w:rPr>
+                          <w:rFonts w:ascii="Arial" w:hAnsi="Arial" w:cs="Arial"/>
+                          <w:b/>
+                          <w:color w:val="1F4E79"/>
+                          <w:sz w:val="24"/>
+                          <w:szCs w:val="24"/>
+                        </w:rPr>
+                        <w:t>company_requesting_agency</w:t>
+                      </w:r>
+                      <w:proofErr w:type="spellEnd"/>
+                      <w:r>
+                        <w:rPr>
+                          <w:rFonts w:ascii="Arial" w:hAnsi="Arial" w:cs="Arial"/>
+                          <w:b/>
+                          <w:color w:val="1F4E79"/>
+                          <w:sz w:val="24"/>
+                          <w:szCs w:val="24"/>
+                        </w:rPr>
+                        <w:t>}}</w:t>
                       </w:r>
                     </w:p>
                     <w:p>
@@ -2480,7 +2735,31 @@
                                 <w:szCs w:val="24"/>
                                 <w:u w:val="single"/>
                               </w:rPr>
-                              <w:t>{{date_of_birth}}</w:t>
+                              <w:t>{{</w:t>
+                            </w:r>
+                            <w:proofErr w:type="spellStart"/>
+                            <w:r>
+                              <w:rPr>
+                                <w:rFonts w:ascii="Arial" w:hAnsi="Arial" w:cs="Arial"/>
+                                <w:b/>
+                                <w:color w:val="1F4E79"/>
+                                <w:sz w:val="24"/>
+                                <w:szCs w:val="24"/>
+                                <w:u w:val="single"/>
+                              </w:rPr>
+                              <w:t>date_of_birth</w:t>
+                            </w:r>
+                            <w:proofErr w:type="spellEnd"/>
+                            <w:r>
+                              <w:rPr>
+                                <w:rFonts w:ascii="Arial" w:hAnsi="Arial" w:cs="Arial"/>
+                                <w:b/>
+                                <w:color w:val="1F4E79"/>
+                                <w:sz w:val="24"/>
+                                <w:szCs w:val="24"/>
+                                <w:u w:val="single"/>
+                              </w:rPr>
+                              <w:t>}}</w:t>
                             </w:r>
                           </w:p>
                           <w:p>
@@ -2513,7 +2792,7 @@
           </mc:Choice>
           <mc:Fallback>
             <w:pict>
-              <v:shape w14:anchorId="22852D50" id="Text Box 4" o:spid="_x0000_s1035" type="#_x0000_t202" style="position:absolute;margin-left:312.65pt;margin-top:.45pt;width:232.8pt;height:24pt;z-index:251665408;visibility:visible;mso-wrap-style:square;mso-width-percent:0;mso-height-percent:0;mso-wrap-distance-left:9pt;mso-wrap-distance-top:0;mso-wrap-distance-right:9pt;mso-wrap-distance-bottom:0;mso-position-horizontal:absolute;mso-position-horizontal-relative:margin;mso-position-vertical:absolute;mso-position-vertical-relative:text;mso-width-percent:0;mso-height-percent:0;mso-width-relative:margin;mso-height-relative:margin;v-text-anchor:top" o:gfxdata="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" filled="f" stroked="f">
+              <v:shape w14:anchorId="22852D50" id="Text Box 4" o:spid="_x0000_s1036" type="#_x0000_t202" style="position:absolute;margin-left:312.65pt;margin-top:.45pt;width:232.8pt;height:24pt;z-index:251665408;visibility:visible;mso-wrap-style:square;mso-width-percent:0;mso-height-percent:0;mso-wrap-distance-left:9pt;mso-wrap-distance-top:0;mso-wrap-distance-right:9pt;mso-wrap-distance-bottom:0;mso-position-horizontal:absolute;mso-position-horizontal-relative:margin;mso-position-vertical:absolute;mso-position-vertical-relative:text;mso-width-percent:0;mso-height-percent:0;mso-width-relative:margin;mso-height-relative:margin;v-text-anchor:top" o:gfxdata="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" filled="f" stroked="f">
                 <v:textbox>
                   <w:txbxContent>
                     <w:p>
@@ -4335,8 +4614,20 @@
                 <w:sz w:val="20"/>
                 <w:szCs w:val="20"/>
               </w:rPr>
-              <w:t>Years of Experience In;</w:t>
+              <w:t xml:space="preserve">Years of Experience </w:t>
             </w:r>
+            <w:proofErr w:type="gramStart"/>
+            <w:r>
+              <w:rPr>
+                <w:rFonts w:ascii="Arial" w:hAnsi="Arial" w:cs="Arial"/>
+                <w:b/>
+                <w:color w:val="002060"/>
+                <w:sz w:val="20"/>
+                <w:szCs w:val="20"/>
+              </w:rPr>
+              <w:t>In;</w:t>
+            </w:r>
+            <w:proofErr w:type="gramEnd"/>
           </w:p>
           <w:p>
             <w:pPr>
@@ -5071,7 +5362,7 @@
           </mc:Choice>
           <mc:Fallback>
             <w:pict>
-              <v:shape w14:anchorId="50AFD288" id="Text Box 2" o:spid="_x0000_s1036" type="#_x0000_t202" style="position:absolute;margin-left:80.15pt;margin-top:10.8pt;width:458.1pt;height:81.5pt;z-index:251661312;visibility:visible;mso-wrap-style:square;mso-width-percent:0;mso-height-percent:0;mso-wrap-distance-left:9pt;mso-wrap-distance-top:0;mso-wrap-distance-right:9pt;mso-wrap-distance-bottom:0;mso-position-horizontal:absolute;mso-position-horizontal-relative:margin;mso-position-vertical:absolute;mso-position-vertical-relative:text;mso-width-percent:0;mso-height-percent:0;mso-width-relative:margin;mso-height-relative:margin;v-text-anchor:top" o:gfxdata="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" filled="f" stroked="f">
+              <v:shape w14:anchorId="50AFD288" id="Text Box 2" o:spid="_x0000_s1037" type="#_x0000_t202" style="position:absolute;margin-left:80.15pt;margin-top:10.8pt;width:458.1pt;height:81.5pt;z-index:251661312;visibility:visible;mso-wrap-style:square;mso-width-percent:0;mso-height-percent:0;mso-wrap-distance-left:9pt;mso-wrap-distance-top:0;mso-wrap-distance-right:9pt;mso-wrap-distance-bottom:0;mso-position-horizontal:absolute;mso-position-horizontal-relative:margin;mso-position-vertical:absolute;mso-position-vertical-relative:text;mso-width-percent:0;mso-height-percent:0;mso-width-relative:margin;mso-height-relative:margin;v-text-anchor:top" o:gfxdata="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" filled="f" stroked="f">
                 <v:textbox>
                   <w:txbxContent>
                     <w:p>
@@ -5384,8 +5675,9 @@
           <w:sz w:val="24"/>
           <w:szCs w:val="24"/>
         </w:rPr>
-        <w:t xml:space="preserve">                                                   </w:t>
-      </w:r>
+        <w:t xml:space="preserve">                                                </w:t>
+      </w:r>
+      <w:proofErr w:type="gramStart"/>
       <w:r>
         <w:rPr>
           <w:rFonts w:ascii="Arial" w:hAnsi="Arial" w:cs="Arial"/>
@@ -5394,6 +5686,16 @@
           <w:sz w:val="24"/>
           <w:szCs w:val="24"/>
         </w:rPr>
+        <w:t xml:space="preserve">   </w:t>
+      </w:r>
+      <w:r>
+        <w:rPr>
+          <w:rFonts w:ascii="Arial" w:hAnsi="Arial" w:cs="Arial"/>
+          <w:b/>
+          <w:color w:val="002060"/>
+          <w:sz w:val="24"/>
+          <w:szCs w:val="24"/>
+        </w:rPr>
         <w:t>[</w:t>
       </w:r>
       <w:r>
@@ -5414,7 +5716,18 @@
           <w:sz w:val="24"/>
           <w:szCs w:val="24"/>
         </w:rPr>
-        <w:t>] Firearm License/PTCFOR</w:t>
+        <w:t>]</w:t>
+      </w:r>
+      <w:proofErr w:type="gramEnd"/>
+      <w:r>
+        <w:rPr>
+          <w:rFonts w:ascii="Arial" w:hAnsi="Arial" w:cs="Arial"/>
+          <w:b/>
+          <w:color w:val="002060"/>
+          <w:sz w:val="24"/>
+          <w:szCs w:val="24"/>
+        </w:rPr>
+        <w:t xml:space="preserve"> Firearm License/PTCFOR</w:t>
       </w:r>
     </w:p>
     <w:p>
@@ -5497,8 +5810,9 @@
           <w:sz w:val="24"/>
           <w:szCs w:val="24"/>
         </w:rPr>
-        <w:t xml:space="preserve">  [</w:t>
-      </w:r>
+        <w:t xml:space="preserve">  </w:t>
+      </w:r>
+      <w:proofErr w:type="gramStart"/>
       <w:r>
         <w:rPr>
           <w:rFonts w:ascii="Arial" w:hAnsi="Arial" w:cs="Arial"/>
@@ -5507,6 +5821,16 @@
           <w:sz w:val="24"/>
           <w:szCs w:val="24"/>
         </w:rPr>
+        <w:t>[</w:t>
+      </w:r>
+      <w:r>
+        <w:rPr>
+          <w:rFonts w:ascii="Arial" w:hAnsi="Arial" w:cs="Arial"/>
+          <w:b/>
+          <w:color w:val="002060"/>
+          <w:sz w:val="24"/>
+          <w:szCs w:val="24"/>
+        </w:rPr>
         <w:t xml:space="preserve">  </w:t>
       </w:r>
       <w:r>
@@ -5517,7 +5841,18 @@
           <w:sz w:val="24"/>
           <w:szCs w:val="24"/>
         </w:rPr>
-        <w:t>] Security Guard License/ SO License</w:t>
+        <w:t>]</w:t>
+      </w:r>
+      <w:proofErr w:type="gramEnd"/>
+      <w:r>
+        <w:rPr>
+          <w:rFonts w:ascii="Arial" w:hAnsi="Arial" w:cs="Arial"/>
+          <w:b/>
+          <w:color w:val="002060"/>
+          <w:sz w:val="24"/>
+          <w:szCs w:val="24"/>
+        </w:rPr>
+        <w:t xml:space="preserve"> Security Guard License/ SO License</w:t>
       </w:r>
     </w:p>
     <w:p>
@@ -5532,6 +5867,7 @@
           <w:szCs w:val="24"/>
         </w:rPr>
       </w:pPr>
+      <w:proofErr w:type="gramStart"/>
       <w:r>
         <w:rPr>
           <w:rFonts w:ascii="Arial" w:hAnsi="Arial" w:cs="Arial"/>
@@ -5550,8 +5886,9 @@
           <w:sz w:val="24"/>
           <w:szCs w:val="24"/>
         </w:rPr>
-        <w:t xml:space="preserve"> ] Not Recommended</w:t>
-      </w:r>
+        <w:t xml:space="preserve"> ]</w:t>
+      </w:r>
+      <w:proofErr w:type="gramEnd"/>
       <w:r>
         <w:rPr>
           <w:rFonts w:ascii="Arial" w:hAnsi="Arial" w:cs="Arial"/>
@@ -5560,6 +5897,16 @@
           <w:sz w:val="24"/>
           <w:szCs w:val="24"/>
         </w:rPr>
+        <w:t xml:space="preserve"> Not Recommended</w:t>
+      </w:r>
+      <w:r>
+        <w:rPr>
+          <w:rFonts w:ascii="Arial" w:hAnsi="Arial" w:cs="Arial"/>
+          <w:b/>
+          <w:color w:val="002060"/>
+          <w:sz w:val="24"/>
+          <w:szCs w:val="24"/>
+        </w:rPr>
         <w:tab/>
       </w:r>
       <w:r>
@@ -5570,8 +5917,9 @@
           <w:sz w:val="24"/>
           <w:szCs w:val="24"/>
         </w:rPr>
-        <w:t xml:space="preserve">                                                   </w:t>
-      </w:r>
+        <w:t xml:space="preserve">                                                </w:t>
+      </w:r>
+      <w:proofErr w:type="gramStart"/>
       <w:r>
         <w:rPr>
           <w:rFonts w:ascii="Arial" w:hAnsi="Arial" w:cs="Arial"/>
@@ -5580,6 +5928,16 @@
           <w:sz w:val="24"/>
           <w:szCs w:val="24"/>
         </w:rPr>
+        <w:t xml:space="preserve">   </w:t>
+      </w:r>
+      <w:r>
+        <w:rPr>
+          <w:rFonts w:ascii="Arial" w:hAnsi="Arial" w:cs="Arial"/>
+          <w:b/>
+          <w:color w:val="002060"/>
+          <w:sz w:val="24"/>
+          <w:szCs w:val="24"/>
+        </w:rPr>
         <w:t>[</w:t>
       </w:r>
       <w:r>
@@ -5600,7 +5958,18 @@
           <w:sz w:val="24"/>
           <w:szCs w:val="24"/>
         </w:rPr>
-        <w:t>] L</w:t>
+        <w:t>]</w:t>
+      </w:r>
+      <w:proofErr w:type="gramEnd"/>
+      <w:r>
+        <w:rPr>
+          <w:rFonts w:ascii="Arial" w:hAnsi="Arial" w:cs="Arial"/>
+          <w:b/>
+          <w:color w:val="002060"/>
+          <w:sz w:val="24"/>
+          <w:szCs w:val="24"/>
+        </w:rPr>
+        <w:t xml:space="preserve"> L</w:t>
       </w:r>
       <w:r>
         <w:rPr>
@@ -5695,6 +6064,7 @@
         </w:rPr>
         <w:t xml:space="preserve">                             </w:t>
       </w:r>
+      <w:proofErr w:type="gramStart"/>
       <w:r>
         <w:rPr>
           <w:rFonts w:ascii="Arial" w:hAnsi="Arial" w:cs="Arial"/>
@@ -5723,7 +6093,18 @@
           <w:sz w:val="24"/>
           <w:szCs w:val="24"/>
         </w:rPr>
-        <w:t xml:space="preserve">] </w:t>
+        <w:t>]</w:t>
+      </w:r>
+      <w:proofErr w:type="gramEnd"/>
+      <w:r>
+        <w:rPr>
+          <w:rFonts w:ascii="Arial" w:hAnsi="Arial" w:cs="Arial"/>
+          <w:b/>
+          <w:color w:val="002060"/>
+          <w:sz w:val="24"/>
+          <w:szCs w:val="24"/>
+        </w:rPr>
+        <w:t xml:space="preserve"> </w:t>
       </w:r>
       <w:r>
         <w:rPr>

</xml_diff>